<commit_message>
Update Unicode book manuscripts
</commit_message>
<xml_diff>
--- a/manuscripts/Unicode/অনুবাদ কবিতা (Unicode).docx
+++ b/manuscripts/Unicode/অনুবাদ কবিতা (Unicode).docx
@@ -769,7 +769,55 @@
           <w:rFonts w:ascii="Nirmala UI" w:hAnsi="Nirmala UI" w:cs="Nirmala UI"/>
           <w:lang w:bidi="bn-BD"/>
         </w:rPr>
-        <w:t xml:space="preserve">সে গুনগুন করে কী বলছিল— </w:t>
+        <w:t xml:space="preserve">সে গুনগুন </w:t>
+      </w:r>
+      <w:proofErr w:type="spellStart"/>
+      <w:r>
+        <w:rPr>
+          <w:rFonts w:ascii="Nirmala UI" w:hAnsi="Nirmala UI" w:cs="Nirmala UI"/>
+          <w:lang w:bidi="bn-BD"/>
+        </w:rPr>
+        <w:t>করে</w:t>
+      </w:r>
+      <w:proofErr w:type="spellEnd"/>
+      <w:r>
+        <w:rPr>
+          <w:rFonts w:ascii="Nirmala UI" w:hAnsi="Nirmala UI" w:cs="Nirmala UI"/>
+          <w:lang w:bidi="bn-BD"/>
+        </w:rPr>
+        <w:t xml:space="preserve"> </w:t>
+      </w:r>
+      <w:proofErr w:type="spellStart"/>
+      <w:r>
+        <w:rPr>
+          <w:rFonts w:ascii="Nirmala UI" w:hAnsi="Nirmala UI" w:cs="Nirmala UI"/>
+          <w:lang w:bidi="bn-BD"/>
+        </w:rPr>
+        <w:t>কী</w:t>
+      </w:r>
+      <w:proofErr w:type="spellEnd"/>
+      <w:r>
+        <w:rPr>
+          <w:rFonts w:ascii="Nirmala UI" w:hAnsi="Nirmala UI" w:cs="Nirmala UI"/>
+          <w:lang w:bidi="bn-BD"/>
+        </w:rPr>
+        <w:t xml:space="preserve"> </w:t>
+      </w:r>
+      <w:proofErr w:type="spellStart"/>
+      <w:r>
+        <w:rPr>
+          <w:rFonts w:ascii="Nirmala UI" w:hAnsi="Nirmala UI" w:cs="Nirmala UI"/>
+          <w:lang w:bidi="bn-BD"/>
+        </w:rPr>
+        <w:t>বলছিল</w:t>
+      </w:r>
+      <w:proofErr w:type="spellEnd"/>
+      <w:r>
+        <w:rPr>
+          <w:rFonts w:ascii="Nirmala UI" w:hAnsi="Nirmala UI" w:cs="Nirmala UI"/>
+          <w:lang w:bidi="bn-BD"/>
+        </w:rPr>
+        <w:t xml:space="preserve">— </w:t>
       </w:r>
       <w:proofErr w:type="spellStart"/>
       <w:r>
@@ -843,12 +891,53 @@
           <w:lang w:bidi="bn-BD"/>
         </w:rPr>
       </w:pPr>
-      <w:r>
-        <w:rPr>
-          <w:rFonts w:ascii="Nirmala UI" w:hAnsi="Nirmala UI" w:cs="Nirmala UI"/>
-          <w:lang w:bidi="bn-BD"/>
-        </w:rPr>
-        <w:t xml:space="preserve">সম্ভবত এটি ছিল </w:t>
+      <w:proofErr w:type="spellStart"/>
+      <w:r>
+        <w:rPr>
+          <w:rFonts w:ascii="Nirmala UI" w:hAnsi="Nirmala UI" w:cs="Nirmala UI"/>
+          <w:lang w:bidi="bn-BD"/>
+        </w:rPr>
+        <w:t>সম্ভবত</w:t>
+      </w:r>
+      <w:proofErr w:type="spellEnd"/>
+      <w:r>
+        <w:rPr>
+          <w:rFonts w:ascii="Nirmala UI" w:hAnsi="Nirmala UI" w:cs="Nirmala UI"/>
+          <w:lang w:bidi="bn-BD"/>
+        </w:rPr>
+        <w:t xml:space="preserve"> </w:t>
+      </w:r>
+      <w:proofErr w:type="spellStart"/>
+      <w:r>
+        <w:rPr>
+          <w:rFonts w:ascii="Nirmala UI" w:hAnsi="Nirmala UI" w:cs="Nirmala UI"/>
+          <w:lang w:bidi="bn-BD"/>
+        </w:rPr>
+        <w:t>এটি</w:t>
+      </w:r>
+      <w:proofErr w:type="spellEnd"/>
+      <w:r>
+        <w:rPr>
+          <w:rFonts w:ascii="Nirmala UI" w:hAnsi="Nirmala UI" w:cs="Nirmala UI"/>
+          <w:lang w:bidi="bn-BD"/>
+        </w:rPr>
+        <w:t xml:space="preserve"> </w:t>
+      </w:r>
+      <w:proofErr w:type="spellStart"/>
+      <w:r>
+        <w:rPr>
+          <w:rFonts w:ascii="Nirmala UI" w:hAnsi="Nirmala UI" w:cs="Nirmala UI"/>
+          <w:lang w:bidi="bn-BD"/>
+        </w:rPr>
+        <w:t>ছিল</w:t>
+      </w:r>
+      <w:proofErr w:type="spellEnd"/>
+      <w:r>
+        <w:rPr>
+          <w:rFonts w:ascii="Nirmala UI" w:hAnsi="Nirmala UI" w:cs="Nirmala UI"/>
+          <w:lang w:bidi="bn-BD"/>
+        </w:rPr>
+        <w:t xml:space="preserve"> </w:t>
       </w:r>
       <w:proofErr w:type="spellStart"/>
       <w:r>
@@ -1859,7 +1948,55 @@
           <w:rFonts w:ascii="Nirmala UI" w:hAnsi="Nirmala UI" w:cs="Nirmala UI"/>
           <w:lang w:bidi="bn-BD"/>
         </w:rPr>
-        <w:t xml:space="preserve">এ মধুর স্বপ্ন শুধু </w:t>
+        <w:t xml:space="preserve">এ </w:t>
+      </w:r>
+      <w:proofErr w:type="spellStart"/>
+      <w:r>
+        <w:rPr>
+          <w:rFonts w:ascii="Nirmala UI" w:hAnsi="Nirmala UI" w:cs="Nirmala UI"/>
+          <w:lang w:bidi="bn-BD"/>
+        </w:rPr>
+        <w:t>মধুর</w:t>
+      </w:r>
+      <w:proofErr w:type="spellEnd"/>
+      <w:r>
+        <w:rPr>
+          <w:rFonts w:ascii="Nirmala UI" w:hAnsi="Nirmala UI" w:cs="Nirmala UI"/>
+          <w:lang w:bidi="bn-BD"/>
+        </w:rPr>
+        <w:t xml:space="preserve"> </w:t>
+      </w:r>
+      <w:proofErr w:type="spellStart"/>
+      <w:r>
+        <w:rPr>
+          <w:rFonts w:ascii="Nirmala UI" w:hAnsi="Nirmala UI" w:cs="Nirmala UI"/>
+          <w:lang w:bidi="bn-BD"/>
+        </w:rPr>
+        <w:t>স্বপ্ন</w:t>
+      </w:r>
+      <w:proofErr w:type="spellEnd"/>
+      <w:r>
+        <w:rPr>
+          <w:rFonts w:ascii="Nirmala UI" w:hAnsi="Nirmala UI" w:cs="Nirmala UI"/>
+          <w:lang w:bidi="bn-BD"/>
+        </w:rPr>
+        <w:t xml:space="preserve"> </w:t>
+      </w:r>
+      <w:proofErr w:type="spellStart"/>
+      <w:r>
+        <w:rPr>
+          <w:rFonts w:ascii="Nirmala UI" w:hAnsi="Nirmala UI" w:cs="Nirmala UI"/>
+          <w:lang w:bidi="bn-BD"/>
+        </w:rPr>
+        <w:t>শুধু</w:t>
+      </w:r>
+      <w:proofErr w:type="spellEnd"/>
+      <w:r>
+        <w:rPr>
+          <w:rFonts w:ascii="Nirmala UI" w:hAnsi="Nirmala UI" w:cs="Nirmala UI"/>
+          <w:lang w:bidi="bn-BD"/>
+        </w:rPr>
+        <w:t xml:space="preserve"> </w:t>
       </w:r>
       <w:proofErr w:type="spellStart"/>
       <w:r>
@@ -2857,12 +2994,37 @@
           <w:lang w:bidi="bn-BD"/>
         </w:rPr>
       </w:pPr>
-      <w:r>
-        <w:rPr>
-          <w:rFonts w:ascii="Nirmala UI" w:hAnsi="Nirmala UI" w:cs="Nirmala UI"/>
-          <w:lang w:bidi="bn-BD"/>
-        </w:rPr>
-        <w:t xml:space="preserve">ম্লান ï®‹ </w:t>
+      <w:proofErr w:type="spellStart"/>
+      <w:r>
+        <w:rPr>
+          <w:rFonts w:ascii="Nirmala UI" w:hAnsi="Nirmala UI" w:cs="Nirmala UI"/>
+          <w:lang w:bidi="bn-BD"/>
+        </w:rPr>
+        <w:t>ম্লান</w:t>
+      </w:r>
+      <w:proofErr w:type="spellEnd"/>
+      <w:r>
+        <w:rPr>
+          <w:rFonts w:ascii="Nirmala UI" w:hAnsi="Nirmala UI" w:cs="Nirmala UI"/>
+          <w:lang w:bidi="bn-BD"/>
+        </w:rPr>
+        <w:t xml:space="preserve"> </w:t>
+      </w:r>
+      <w:proofErr w:type="spellStart"/>
+      <w:r>
+        <w:rPr>
+          <w:rFonts w:ascii="Nirmala UI" w:hAnsi="Nirmala UI" w:cs="Nirmala UI"/>
+          <w:lang w:bidi="bn-BD"/>
+        </w:rPr>
+        <w:t>শুষ্ক</w:t>
+      </w:r>
+      <w:proofErr w:type="spellEnd"/>
+      <w:r>
+        <w:rPr>
+          <w:rFonts w:ascii="Nirmala UI" w:hAnsi="Nirmala UI" w:cs="Nirmala UI"/>
+          <w:lang w:bidi="bn-BD"/>
+        </w:rPr>
+        <w:t xml:space="preserve"> </w:t>
       </w:r>
       <w:proofErr w:type="spellStart"/>
       <w:r>
@@ -3282,463 +3444,470 @@
           <w:rFonts w:ascii="Nirmala UI" w:hAnsi="Nirmala UI" w:cs="Nirmala UI"/>
           <w:lang w:bidi="bn-BD"/>
         </w:rPr>
-        <w:t>চেতনায়</w:t>
-      </w:r>
-      <w:proofErr w:type="spellEnd"/>
-    </w:p>
-    <w:p>
-      <w:pPr>
-        <w:rPr>
-          <w:rFonts w:ascii="Nirmala UI" w:hAnsi="Nirmala UI" w:cs="Nirmala UI"/>
-          <w:lang w:bidi="bn-BD"/>
-        </w:rPr>
-      </w:pPr>
-      <w:proofErr w:type="spellStart"/>
-      <w:r>
-        <w:rPr>
-          <w:rFonts w:ascii="Nirmala UI" w:hAnsi="Nirmala UI" w:cs="Nirmala UI"/>
-          <w:lang w:bidi="bn-BD"/>
-        </w:rPr>
-        <w:t>নেমে</w:t>
-      </w:r>
-      <w:proofErr w:type="spellEnd"/>
-      <w:r>
-        <w:rPr>
-          <w:rFonts w:ascii="Nirmala UI" w:hAnsi="Nirmala UI" w:cs="Nirmala UI"/>
-          <w:lang w:bidi="bn-BD"/>
-        </w:rPr>
-        <w:t xml:space="preserve"> </w:t>
-      </w:r>
-      <w:proofErr w:type="spellStart"/>
-      <w:r>
-        <w:rPr>
-          <w:rFonts w:ascii="Nirmala UI" w:hAnsi="Nirmala UI" w:cs="Nirmala UI"/>
-          <w:lang w:bidi="bn-BD"/>
-        </w:rPr>
-        <w:t>আসছে</w:t>
-      </w:r>
-      <w:proofErr w:type="spellEnd"/>
-      <w:r>
-        <w:rPr>
-          <w:rFonts w:ascii="Nirmala UI" w:hAnsi="Nirmala UI" w:cs="Nirmala UI"/>
-          <w:lang w:bidi="bn-BD"/>
-        </w:rPr>
-        <w:t xml:space="preserve"> </w:t>
-      </w:r>
-      <w:proofErr w:type="spellStart"/>
-      <w:r>
-        <w:rPr>
-          <w:rFonts w:ascii="Nirmala UI" w:hAnsi="Nirmala UI" w:cs="Nirmala UI"/>
-          <w:lang w:bidi="bn-BD"/>
-        </w:rPr>
-        <w:t>ধীর</w:t>
-      </w:r>
-      <w:proofErr w:type="spellEnd"/>
-      <w:r>
-        <w:rPr>
-          <w:rFonts w:ascii="Nirmala UI" w:hAnsi="Nirmala UI" w:cs="Nirmala UI"/>
-          <w:lang w:bidi="bn-BD"/>
-        </w:rPr>
-        <w:t xml:space="preserve"> </w:t>
-      </w:r>
-      <w:proofErr w:type="spellStart"/>
-      <w:r>
-        <w:rPr>
-          <w:rFonts w:ascii="Nirmala UI" w:hAnsi="Nirmala UI" w:cs="Nirmala UI"/>
-          <w:lang w:bidi="bn-BD"/>
-        </w:rPr>
-        <w:t>চাঞ্চল্যে</w:t>
-      </w:r>
-      <w:proofErr w:type="spellEnd"/>
-    </w:p>
-    <w:p>
-      <w:pPr>
-        <w:rPr>
-          <w:rFonts w:ascii="Nirmala UI" w:hAnsi="Nirmala UI" w:cs="Nirmala UI"/>
-          <w:lang w:bidi="bn-BD"/>
-        </w:rPr>
-      </w:pPr>
-    </w:p>
-    <w:p>
-      <w:pPr>
-        <w:rPr>
-          <w:rFonts w:ascii="Nirmala UI" w:hAnsi="Nirmala UI" w:cs="Nirmala UI"/>
-          <w:lang w:bidi="bn-BD"/>
-        </w:rPr>
-      </w:pPr>
-      <w:proofErr w:type="spellStart"/>
-      <w:r>
-        <w:rPr>
-          <w:rFonts w:ascii="Nirmala UI" w:hAnsi="Nirmala UI" w:cs="Nirmala UI"/>
-          <w:lang w:bidi="bn-BD"/>
-        </w:rPr>
-        <w:t>আমিও</w:t>
-      </w:r>
-      <w:proofErr w:type="spellEnd"/>
-      <w:r>
-        <w:rPr>
-          <w:rFonts w:ascii="Nirmala UI" w:hAnsi="Nirmala UI" w:cs="Nirmala UI"/>
-          <w:lang w:bidi="bn-BD"/>
-        </w:rPr>
-        <w:t xml:space="preserve"> </w:t>
-      </w:r>
-      <w:proofErr w:type="spellStart"/>
-      <w:r>
-        <w:rPr>
-          <w:rFonts w:ascii="Nirmala UI" w:hAnsi="Nirmala UI" w:cs="Nirmala UI"/>
-          <w:lang w:bidi="bn-BD"/>
-        </w:rPr>
-        <w:t>খুব</w:t>
-      </w:r>
-      <w:proofErr w:type="spellEnd"/>
-      <w:r>
-        <w:rPr>
-          <w:rFonts w:ascii="Nirmala UI" w:hAnsi="Nirmala UI" w:cs="Nirmala UI"/>
-          <w:lang w:bidi="bn-BD"/>
-        </w:rPr>
-        <w:t xml:space="preserve"> </w:t>
-      </w:r>
-      <w:proofErr w:type="spellStart"/>
-      <w:r>
-        <w:rPr>
-          <w:rFonts w:ascii="Nirmala UI" w:hAnsi="Nirmala UI" w:cs="Nirmala UI"/>
-          <w:lang w:bidi="bn-BD"/>
-        </w:rPr>
-        <w:t>বেশী</w:t>
-      </w:r>
-      <w:proofErr w:type="spellEnd"/>
-      <w:r>
-        <w:rPr>
-          <w:rFonts w:ascii="Nirmala UI" w:hAnsi="Nirmala UI" w:cs="Nirmala UI"/>
-          <w:lang w:bidi="bn-BD"/>
-        </w:rPr>
-        <w:t xml:space="preserve"> </w:t>
-      </w:r>
-      <w:proofErr w:type="spellStart"/>
-      <w:r>
-        <w:rPr>
-          <w:rFonts w:ascii="Nirmala UI" w:hAnsi="Nirmala UI" w:cs="Nirmala UI"/>
-          <w:lang w:bidi="bn-BD"/>
-        </w:rPr>
-        <w:t>দূরে</w:t>
-      </w:r>
-      <w:proofErr w:type="spellEnd"/>
-      <w:r>
-        <w:rPr>
-          <w:rFonts w:ascii="Nirmala UI" w:hAnsi="Nirmala UI" w:cs="Nirmala UI"/>
-          <w:lang w:bidi="bn-BD"/>
-        </w:rPr>
-        <w:t xml:space="preserve"> </w:t>
-      </w:r>
-      <w:proofErr w:type="spellStart"/>
-      <w:r>
-        <w:rPr>
-          <w:rFonts w:ascii="Nirmala UI" w:hAnsi="Nirmala UI" w:cs="Nirmala UI"/>
-          <w:lang w:bidi="bn-BD"/>
-        </w:rPr>
-        <w:t>নই</w:t>
-      </w:r>
-      <w:proofErr w:type="spellEnd"/>
-      <w:r>
-        <w:rPr>
-          <w:rFonts w:ascii="Nirmala UI" w:hAnsi="Nirmala UI" w:cs="Nirmala UI"/>
-          <w:lang w:bidi="bn-BD"/>
-        </w:rPr>
-        <w:t xml:space="preserve"> </w:t>
-      </w:r>
-      <w:proofErr w:type="spellStart"/>
-      <w:r>
-        <w:rPr>
-          <w:rFonts w:ascii="Nirmala UI" w:hAnsi="Nirmala UI" w:cs="Nirmala UI"/>
-          <w:lang w:bidi="bn-BD"/>
-        </w:rPr>
-        <w:t>তার</w:t>
-      </w:r>
-      <w:proofErr w:type="spellEnd"/>
-      <w:r>
-        <w:rPr>
-          <w:rFonts w:ascii="Nirmala UI" w:hAnsi="Nirmala UI" w:cs="Nirmala UI"/>
-          <w:lang w:bidi="bn-BD"/>
-        </w:rPr>
-        <w:t xml:space="preserve"> </w:t>
-      </w:r>
-      <w:proofErr w:type="spellStart"/>
-      <w:r>
-        <w:rPr>
-          <w:rFonts w:ascii="Nirmala UI" w:hAnsi="Nirmala UI" w:cs="Nirmala UI"/>
-          <w:lang w:bidi="bn-BD"/>
-        </w:rPr>
-        <w:t>কাছ</w:t>
-      </w:r>
-      <w:proofErr w:type="spellEnd"/>
-      <w:r>
-        <w:rPr>
-          <w:rFonts w:ascii="Nirmala UI" w:hAnsi="Nirmala UI" w:cs="Nirmala UI"/>
-          <w:lang w:bidi="bn-BD"/>
-        </w:rPr>
-        <w:t xml:space="preserve"> </w:t>
-      </w:r>
-      <w:proofErr w:type="spellStart"/>
-      <w:r>
-        <w:rPr>
-          <w:rFonts w:ascii="Nirmala UI" w:hAnsi="Nirmala UI" w:cs="Nirmala UI"/>
-          <w:lang w:bidi="bn-BD"/>
-        </w:rPr>
-        <w:t>থেকে</w:t>
-      </w:r>
-      <w:proofErr w:type="spellEnd"/>
-    </w:p>
-    <w:p>
-      <w:pPr>
-        <w:rPr>
-          <w:rFonts w:ascii="Nirmala UI" w:hAnsi="Nirmala UI" w:cs="Nirmala UI"/>
-          <w:lang w:bidi="bn-BD"/>
-        </w:rPr>
-      </w:pPr>
-      <w:proofErr w:type="spellStart"/>
-      <w:r>
-        <w:rPr>
-          <w:rFonts w:ascii="Nirmala UI" w:hAnsi="Nirmala UI" w:cs="Nirmala UI"/>
-          <w:lang w:bidi="bn-BD"/>
-        </w:rPr>
-        <w:t>অন্তিমের</w:t>
-      </w:r>
-      <w:proofErr w:type="spellEnd"/>
-      <w:r>
-        <w:rPr>
-          <w:rFonts w:ascii="Nirmala UI" w:hAnsi="Nirmala UI" w:cs="Nirmala UI"/>
-          <w:lang w:bidi="bn-BD"/>
-        </w:rPr>
-        <w:t xml:space="preserve"> </w:t>
-      </w:r>
-      <w:proofErr w:type="spellStart"/>
-      <w:r>
-        <w:rPr>
-          <w:rFonts w:ascii="Nirmala UI" w:hAnsi="Nirmala UI" w:cs="Nirmala UI"/>
-          <w:lang w:bidi="bn-BD"/>
-        </w:rPr>
-        <w:t>অবশিষ্ট</w:t>
-      </w:r>
-      <w:proofErr w:type="spellEnd"/>
-    </w:p>
-    <w:p>
-      <w:pPr>
-        <w:rPr>
-          <w:rFonts w:ascii="Nirmala UI" w:hAnsi="Nirmala UI" w:cs="Nirmala UI"/>
-          <w:lang w:bidi="bn-BD"/>
-        </w:rPr>
-      </w:pPr>
-      <w:proofErr w:type="spellStart"/>
-      <w:r>
-        <w:rPr>
-          <w:rFonts w:ascii="Nirmala UI" w:hAnsi="Nirmala UI" w:cs="Nirmala UI"/>
-          <w:lang w:bidi="bn-BD"/>
-        </w:rPr>
-        <w:t>নক্ষত্রফুল</w:t>
-      </w:r>
-      <w:proofErr w:type="spellEnd"/>
-      <w:r>
-        <w:rPr>
-          <w:rFonts w:ascii="Nirmala UI" w:hAnsi="Nirmala UI" w:cs="Nirmala UI"/>
-          <w:lang w:bidi="bn-BD"/>
-        </w:rPr>
-        <w:t xml:space="preserve"> </w:t>
-      </w:r>
-      <w:proofErr w:type="spellStart"/>
-      <w:r>
-        <w:rPr>
-          <w:rFonts w:ascii="Nirmala UI" w:hAnsi="Nirmala UI" w:cs="Nirmala UI"/>
-          <w:lang w:bidi="bn-BD"/>
-        </w:rPr>
-        <w:t>হতে</w:t>
-      </w:r>
-      <w:proofErr w:type="spellEnd"/>
-      <w:r>
-        <w:rPr>
-          <w:rFonts w:ascii="Nirmala UI" w:hAnsi="Nirmala UI" w:cs="Nirmala UI"/>
-          <w:lang w:bidi="bn-BD"/>
-        </w:rPr>
-        <w:t xml:space="preserve"> </w:t>
-      </w:r>
-      <w:proofErr w:type="spellStart"/>
-      <w:r>
-        <w:rPr>
-          <w:rFonts w:ascii="Nirmala UI" w:hAnsi="Nirmala UI" w:cs="Nirmala UI"/>
-          <w:lang w:bidi="bn-BD"/>
-        </w:rPr>
-        <w:t>কুড়িয়ে</w:t>
-      </w:r>
-      <w:proofErr w:type="spellEnd"/>
-      <w:r>
-        <w:rPr>
-          <w:rFonts w:ascii="Nirmala UI" w:hAnsi="Nirmala UI" w:cs="Nirmala UI"/>
-          <w:lang w:bidi="bn-BD"/>
-        </w:rPr>
-        <w:t xml:space="preserve"> </w:t>
-      </w:r>
-      <w:proofErr w:type="spellStart"/>
-      <w:r>
-        <w:rPr>
-          <w:rFonts w:ascii="Nirmala UI" w:hAnsi="Nirmala UI" w:cs="Nirmala UI"/>
-          <w:lang w:bidi="bn-BD"/>
-        </w:rPr>
-        <w:t>নিয়ে</w:t>
-      </w:r>
-      <w:proofErr w:type="spellEnd"/>
-      <w:r>
-        <w:rPr>
-          <w:rFonts w:ascii="Nirmala UI" w:hAnsi="Nirmala UI" w:cs="Nirmala UI"/>
-          <w:lang w:bidi="bn-BD"/>
-        </w:rPr>
-        <w:t xml:space="preserve"> </w:t>
-      </w:r>
-      <w:proofErr w:type="spellStart"/>
-      <w:r>
-        <w:rPr>
-          <w:rFonts w:ascii="Nirmala UI" w:hAnsi="Nirmala UI" w:cs="Nirmala UI"/>
-          <w:lang w:bidi="bn-BD"/>
-        </w:rPr>
-        <w:t>অনুজ্জ্বল</w:t>
-      </w:r>
-      <w:proofErr w:type="spellEnd"/>
-      <w:r>
-        <w:rPr>
-          <w:rFonts w:ascii="Nirmala UI" w:hAnsi="Nirmala UI" w:cs="Nirmala UI"/>
-          <w:lang w:bidi="bn-BD"/>
-        </w:rPr>
-        <w:t xml:space="preserve"> </w:t>
-      </w:r>
-      <w:proofErr w:type="spellStart"/>
-      <w:r>
-        <w:rPr>
-          <w:rFonts w:ascii="Nirmala UI" w:hAnsi="Nirmala UI" w:cs="Nirmala UI"/>
-          <w:lang w:bidi="bn-BD"/>
-        </w:rPr>
-        <w:t>নীল</w:t>
-      </w:r>
-      <w:proofErr w:type="spellEnd"/>
-    </w:p>
-    <w:p>
-      <w:pPr>
-        <w:rPr>
-          <w:rFonts w:ascii="Nirmala UI" w:hAnsi="Nirmala UI" w:cs="Nirmala UI"/>
-          <w:lang w:bidi="bn-BD"/>
-        </w:rPr>
-      </w:pPr>
-      <w:proofErr w:type="spellStart"/>
-      <w:r>
-        <w:rPr>
-          <w:rFonts w:ascii="Nirmala UI" w:hAnsi="Nirmala UI" w:cs="Nirmala UI"/>
-          <w:lang w:bidi="bn-BD"/>
-        </w:rPr>
-        <w:t>পৌঁছে</w:t>
-      </w:r>
-      <w:proofErr w:type="spellEnd"/>
-      <w:r>
-        <w:rPr>
-          <w:rFonts w:ascii="Nirmala UI" w:hAnsi="Nirmala UI" w:cs="Nirmala UI"/>
-          <w:lang w:bidi="bn-BD"/>
-        </w:rPr>
-        <w:t xml:space="preserve"> </w:t>
-      </w:r>
-      <w:proofErr w:type="spellStart"/>
-      <w:r>
-        <w:rPr>
-          <w:rFonts w:ascii="Nirmala UI" w:hAnsi="Nirmala UI" w:cs="Nirmala UI"/>
-          <w:lang w:bidi="bn-BD"/>
-        </w:rPr>
-        <w:t>দিতে</w:t>
-      </w:r>
-      <w:proofErr w:type="spellEnd"/>
-      <w:r>
-        <w:rPr>
-          <w:rFonts w:ascii="Nirmala UI" w:hAnsi="Nirmala UI" w:cs="Nirmala UI"/>
-          <w:lang w:bidi="bn-BD"/>
-        </w:rPr>
-        <w:t xml:space="preserve"> </w:t>
-      </w:r>
-      <w:proofErr w:type="spellStart"/>
-      <w:r>
-        <w:rPr>
-          <w:rFonts w:ascii="Nirmala UI" w:hAnsi="Nirmala UI" w:cs="Nirmala UI"/>
-          <w:lang w:bidi="bn-BD"/>
-        </w:rPr>
-        <w:t>পুনরায়</w:t>
-      </w:r>
-      <w:proofErr w:type="spellEnd"/>
-      <w:r>
-        <w:rPr>
-          <w:rFonts w:ascii="Nirmala UI" w:hAnsi="Nirmala UI" w:cs="Nirmala UI"/>
-          <w:lang w:bidi="bn-BD"/>
-        </w:rPr>
-        <w:br/>
-      </w:r>
-    </w:p>
-    <w:p>
-      <w:pPr>
-        <w:rPr>
-          <w:rFonts w:ascii="Nirmala UI" w:hAnsi="Nirmala UI" w:cs="Nirmala UI"/>
-          <w:lang w:bidi="bn-BD"/>
-        </w:rPr>
-      </w:pPr>
-    </w:p>
-    <w:p>
-      <w:pPr>
-        <w:rPr>
-          <w:rFonts w:ascii="Nirmala UI" w:hAnsi="Nirmala UI" w:cs="Nirmala UI"/>
-          <w:lang w:bidi="bn-BD"/>
-        </w:rPr>
-      </w:pPr>
-    </w:p>
-    <w:p>
-      <w:pPr>
-        <w:rPr>
-          <w:rFonts w:ascii="Nirmala UI" w:hAnsi="Nirmala UI" w:cs="Nirmala UI"/>
-          <w:lang w:bidi="bn-BD"/>
-        </w:rPr>
-      </w:pPr>
-    </w:p>
-    <w:p>
-      <w:pPr>
-        <w:rPr>
-          <w:rFonts w:ascii="Nirmala UI" w:hAnsi="Nirmala UI" w:cs="Nirmala UI"/>
-          <w:lang w:bidi="bn-BD"/>
-        </w:rPr>
-      </w:pPr>
-    </w:p>
-    <w:p>
-      <w:pPr>
-        <w:rPr>
-          <w:rFonts w:ascii="Nirmala UI" w:hAnsi="Nirmala UI" w:cs="Nirmala UI"/>
-          <w:lang w:bidi="bn-BD"/>
-        </w:rPr>
-      </w:pPr>
-    </w:p>
-    <w:p>
-      <w:pPr>
-        <w:rPr>
-          <w:rFonts w:ascii="Nirmala UI" w:hAnsi="Nirmala UI" w:cs="Nirmala UI"/>
-          <w:lang w:bidi="bn-BD"/>
-        </w:rPr>
-      </w:pPr>
-    </w:p>
-    <w:p>
-      <w:pPr>
-        <w:rPr>
-          <w:rFonts w:ascii="Nirmala UI" w:hAnsi="Nirmala UI" w:cs="Nirmala UI"/>
-          <w:lang w:bidi="bn-BD"/>
-        </w:rPr>
-      </w:pPr>
-    </w:p>
-    <w:p>
-      <w:pPr>
-        <w:rPr>
-          <w:rFonts w:ascii="Nirmala UI" w:hAnsi="Nirmala UI" w:cs="Nirmala UI"/>
-          <w:lang w:bidi="bn-BD"/>
-        </w:rPr>
-      </w:pPr>
+        <w:t>চে</w:t>
+      </w:r>
       <w:bookmarkStart w:id="0" w:name="_GoBack"/>
       <w:bookmarkEnd w:id="0"/>
+      <w:r>
+        <w:rPr>
+          <w:rFonts w:ascii="Nirmala UI" w:hAnsi="Nirmala UI" w:cs="Nirmala UI"/>
+          <w:lang w:bidi="bn-BD"/>
+        </w:rPr>
+        <w:t>তনায়</w:t>
+      </w:r>
+      <w:proofErr w:type="spellEnd"/>
+    </w:p>
+    <w:p>
+      <w:pPr>
+        <w:rPr>
+          <w:rFonts w:ascii="Nirmala UI" w:hAnsi="Nirmala UI" w:cs="Nirmala UI"/>
+          <w:lang w:bidi="bn-BD"/>
+        </w:rPr>
+      </w:pPr>
+      <w:proofErr w:type="spellStart"/>
+      <w:r>
+        <w:rPr>
+          <w:rFonts w:ascii="Nirmala UI" w:hAnsi="Nirmala UI" w:cs="Nirmala UI"/>
+          <w:lang w:bidi="bn-BD"/>
+        </w:rPr>
+        <w:t>নেমে</w:t>
+      </w:r>
+      <w:proofErr w:type="spellEnd"/>
+      <w:r>
+        <w:rPr>
+          <w:rFonts w:ascii="Nirmala UI" w:hAnsi="Nirmala UI" w:cs="Nirmala UI"/>
+          <w:lang w:bidi="bn-BD"/>
+        </w:rPr>
+        <w:t xml:space="preserve"> </w:t>
+      </w:r>
+      <w:proofErr w:type="spellStart"/>
+      <w:r>
+        <w:rPr>
+          <w:rFonts w:ascii="Nirmala UI" w:hAnsi="Nirmala UI" w:cs="Nirmala UI"/>
+          <w:lang w:bidi="bn-BD"/>
+        </w:rPr>
+        <w:t>আসছে</w:t>
+      </w:r>
+      <w:proofErr w:type="spellEnd"/>
+      <w:r>
+        <w:rPr>
+          <w:rFonts w:ascii="Nirmala UI" w:hAnsi="Nirmala UI" w:cs="Nirmala UI"/>
+          <w:lang w:bidi="bn-BD"/>
+        </w:rPr>
+        <w:t xml:space="preserve"> </w:t>
+      </w:r>
+      <w:proofErr w:type="spellStart"/>
+      <w:r>
+        <w:rPr>
+          <w:rFonts w:ascii="Nirmala UI" w:hAnsi="Nirmala UI" w:cs="Nirmala UI"/>
+          <w:lang w:bidi="bn-BD"/>
+        </w:rPr>
+        <w:t>ধীর</w:t>
+      </w:r>
+      <w:proofErr w:type="spellEnd"/>
+      <w:r>
+        <w:rPr>
+          <w:rFonts w:ascii="Nirmala UI" w:hAnsi="Nirmala UI" w:cs="Nirmala UI"/>
+          <w:lang w:bidi="bn-BD"/>
+        </w:rPr>
+        <w:t xml:space="preserve"> </w:t>
+      </w:r>
+      <w:proofErr w:type="spellStart"/>
+      <w:r>
+        <w:rPr>
+          <w:rFonts w:ascii="Nirmala UI" w:hAnsi="Nirmala UI" w:cs="Nirmala UI"/>
+          <w:lang w:bidi="bn-BD"/>
+        </w:rPr>
+        <w:t>চাঞ্চল্যে</w:t>
+      </w:r>
+      <w:proofErr w:type="spellEnd"/>
+    </w:p>
+    <w:p>
+      <w:pPr>
+        <w:rPr>
+          <w:rFonts w:ascii="Nirmala UI" w:hAnsi="Nirmala UI" w:cs="Nirmala UI"/>
+          <w:lang w:bidi="bn-BD"/>
+        </w:rPr>
+      </w:pPr>
+    </w:p>
+    <w:p>
+      <w:pPr>
+        <w:rPr>
+          <w:rFonts w:ascii="Nirmala UI" w:hAnsi="Nirmala UI" w:cs="Nirmala UI"/>
+          <w:lang w:bidi="bn-BD"/>
+        </w:rPr>
+      </w:pPr>
+      <w:proofErr w:type="spellStart"/>
+      <w:r>
+        <w:rPr>
+          <w:rFonts w:ascii="Nirmala UI" w:hAnsi="Nirmala UI" w:cs="Nirmala UI"/>
+          <w:lang w:bidi="bn-BD"/>
+        </w:rPr>
+        <w:t>আমিও</w:t>
+      </w:r>
+      <w:proofErr w:type="spellEnd"/>
+      <w:r>
+        <w:rPr>
+          <w:rFonts w:ascii="Nirmala UI" w:hAnsi="Nirmala UI" w:cs="Nirmala UI"/>
+          <w:lang w:bidi="bn-BD"/>
+        </w:rPr>
+        <w:t xml:space="preserve"> </w:t>
+      </w:r>
+      <w:proofErr w:type="spellStart"/>
+      <w:r>
+        <w:rPr>
+          <w:rFonts w:ascii="Nirmala UI" w:hAnsi="Nirmala UI" w:cs="Nirmala UI"/>
+          <w:lang w:bidi="bn-BD"/>
+        </w:rPr>
+        <w:t>খুব</w:t>
+      </w:r>
+      <w:proofErr w:type="spellEnd"/>
+      <w:r>
+        <w:rPr>
+          <w:rFonts w:ascii="Nirmala UI" w:hAnsi="Nirmala UI" w:cs="Nirmala UI"/>
+          <w:lang w:bidi="bn-BD"/>
+        </w:rPr>
+        <w:t xml:space="preserve"> </w:t>
+      </w:r>
+      <w:proofErr w:type="spellStart"/>
+      <w:r>
+        <w:rPr>
+          <w:rFonts w:ascii="Nirmala UI" w:hAnsi="Nirmala UI" w:cs="Nirmala UI"/>
+          <w:lang w:bidi="bn-BD"/>
+        </w:rPr>
+        <w:t>বেশী</w:t>
+      </w:r>
+      <w:proofErr w:type="spellEnd"/>
+      <w:r>
+        <w:rPr>
+          <w:rFonts w:ascii="Nirmala UI" w:hAnsi="Nirmala UI" w:cs="Nirmala UI"/>
+          <w:lang w:bidi="bn-BD"/>
+        </w:rPr>
+        <w:t xml:space="preserve"> </w:t>
+      </w:r>
+      <w:proofErr w:type="spellStart"/>
+      <w:r>
+        <w:rPr>
+          <w:rFonts w:ascii="Nirmala UI" w:hAnsi="Nirmala UI" w:cs="Nirmala UI"/>
+          <w:lang w:bidi="bn-BD"/>
+        </w:rPr>
+        <w:t>দূরে</w:t>
+      </w:r>
+      <w:proofErr w:type="spellEnd"/>
+      <w:r>
+        <w:rPr>
+          <w:rFonts w:ascii="Nirmala UI" w:hAnsi="Nirmala UI" w:cs="Nirmala UI"/>
+          <w:lang w:bidi="bn-BD"/>
+        </w:rPr>
+        <w:t xml:space="preserve"> </w:t>
+      </w:r>
+      <w:proofErr w:type="spellStart"/>
+      <w:r>
+        <w:rPr>
+          <w:rFonts w:ascii="Nirmala UI" w:hAnsi="Nirmala UI" w:cs="Nirmala UI"/>
+          <w:lang w:bidi="bn-BD"/>
+        </w:rPr>
+        <w:t>নই</w:t>
+      </w:r>
+      <w:proofErr w:type="spellEnd"/>
+      <w:r>
+        <w:rPr>
+          <w:rFonts w:ascii="Nirmala UI" w:hAnsi="Nirmala UI" w:cs="Nirmala UI"/>
+          <w:lang w:bidi="bn-BD"/>
+        </w:rPr>
+        <w:t xml:space="preserve"> </w:t>
+      </w:r>
+      <w:proofErr w:type="spellStart"/>
+      <w:r>
+        <w:rPr>
+          <w:rFonts w:ascii="Nirmala UI" w:hAnsi="Nirmala UI" w:cs="Nirmala UI"/>
+          <w:lang w:bidi="bn-BD"/>
+        </w:rPr>
+        <w:t>তার</w:t>
+      </w:r>
+      <w:proofErr w:type="spellEnd"/>
+      <w:r>
+        <w:rPr>
+          <w:rFonts w:ascii="Nirmala UI" w:hAnsi="Nirmala UI" w:cs="Nirmala UI"/>
+          <w:lang w:bidi="bn-BD"/>
+        </w:rPr>
+        <w:t xml:space="preserve"> </w:t>
+      </w:r>
+      <w:proofErr w:type="spellStart"/>
+      <w:r>
+        <w:rPr>
+          <w:rFonts w:ascii="Nirmala UI" w:hAnsi="Nirmala UI" w:cs="Nirmala UI"/>
+          <w:lang w:bidi="bn-BD"/>
+        </w:rPr>
+        <w:t>কাছ</w:t>
+      </w:r>
+      <w:proofErr w:type="spellEnd"/>
+      <w:r>
+        <w:rPr>
+          <w:rFonts w:ascii="Nirmala UI" w:hAnsi="Nirmala UI" w:cs="Nirmala UI"/>
+          <w:lang w:bidi="bn-BD"/>
+        </w:rPr>
+        <w:t xml:space="preserve"> </w:t>
+      </w:r>
+      <w:proofErr w:type="spellStart"/>
+      <w:r>
+        <w:rPr>
+          <w:rFonts w:ascii="Nirmala UI" w:hAnsi="Nirmala UI" w:cs="Nirmala UI"/>
+          <w:lang w:bidi="bn-BD"/>
+        </w:rPr>
+        <w:t>থেকে</w:t>
+      </w:r>
+      <w:proofErr w:type="spellEnd"/>
+    </w:p>
+    <w:p>
+      <w:pPr>
+        <w:rPr>
+          <w:rFonts w:ascii="Nirmala UI" w:hAnsi="Nirmala UI" w:cs="Nirmala UI"/>
+          <w:lang w:bidi="bn-BD"/>
+        </w:rPr>
+      </w:pPr>
+      <w:proofErr w:type="spellStart"/>
+      <w:r>
+        <w:rPr>
+          <w:rFonts w:ascii="Nirmala UI" w:hAnsi="Nirmala UI" w:cs="Nirmala UI"/>
+          <w:lang w:bidi="bn-BD"/>
+        </w:rPr>
+        <w:t>অন্তিমের</w:t>
+      </w:r>
+      <w:proofErr w:type="spellEnd"/>
+      <w:r>
+        <w:rPr>
+          <w:rFonts w:ascii="Nirmala UI" w:hAnsi="Nirmala UI" w:cs="Nirmala UI"/>
+          <w:lang w:bidi="bn-BD"/>
+        </w:rPr>
+        <w:t xml:space="preserve"> </w:t>
+      </w:r>
+      <w:proofErr w:type="spellStart"/>
+      <w:r>
+        <w:rPr>
+          <w:rFonts w:ascii="Nirmala UI" w:hAnsi="Nirmala UI" w:cs="Nirmala UI"/>
+          <w:lang w:bidi="bn-BD"/>
+        </w:rPr>
+        <w:t>অবশিষ্ট</w:t>
+      </w:r>
+      <w:proofErr w:type="spellEnd"/>
+    </w:p>
+    <w:p>
+      <w:pPr>
+        <w:rPr>
+          <w:rFonts w:ascii="Nirmala UI" w:hAnsi="Nirmala UI" w:cs="Nirmala UI"/>
+          <w:lang w:bidi="bn-BD"/>
+        </w:rPr>
+      </w:pPr>
+      <w:proofErr w:type="spellStart"/>
+      <w:r>
+        <w:rPr>
+          <w:rFonts w:ascii="Nirmala UI" w:hAnsi="Nirmala UI" w:cs="Nirmala UI"/>
+          <w:lang w:bidi="bn-BD"/>
+        </w:rPr>
+        <w:t>নক্ষত্রফুল</w:t>
+      </w:r>
+      <w:proofErr w:type="spellEnd"/>
+      <w:r>
+        <w:rPr>
+          <w:rFonts w:ascii="Nirmala UI" w:hAnsi="Nirmala UI" w:cs="Nirmala UI"/>
+          <w:lang w:bidi="bn-BD"/>
+        </w:rPr>
+        <w:t xml:space="preserve"> </w:t>
+      </w:r>
+      <w:proofErr w:type="spellStart"/>
+      <w:r>
+        <w:rPr>
+          <w:rFonts w:ascii="Nirmala UI" w:hAnsi="Nirmala UI" w:cs="Nirmala UI"/>
+          <w:lang w:bidi="bn-BD"/>
+        </w:rPr>
+        <w:t>হতে</w:t>
+      </w:r>
+      <w:proofErr w:type="spellEnd"/>
+      <w:r>
+        <w:rPr>
+          <w:rFonts w:ascii="Nirmala UI" w:hAnsi="Nirmala UI" w:cs="Nirmala UI"/>
+          <w:lang w:bidi="bn-BD"/>
+        </w:rPr>
+        <w:t xml:space="preserve"> </w:t>
+      </w:r>
+      <w:proofErr w:type="spellStart"/>
+      <w:r>
+        <w:rPr>
+          <w:rFonts w:ascii="Nirmala UI" w:hAnsi="Nirmala UI" w:cs="Nirmala UI"/>
+          <w:lang w:bidi="bn-BD"/>
+        </w:rPr>
+        <w:t>কুড়িয়ে</w:t>
+      </w:r>
+      <w:proofErr w:type="spellEnd"/>
+      <w:r>
+        <w:rPr>
+          <w:rFonts w:ascii="Nirmala UI" w:hAnsi="Nirmala UI" w:cs="Nirmala UI"/>
+          <w:lang w:bidi="bn-BD"/>
+        </w:rPr>
+        <w:t xml:space="preserve"> </w:t>
+      </w:r>
+      <w:proofErr w:type="spellStart"/>
+      <w:r>
+        <w:rPr>
+          <w:rFonts w:ascii="Nirmala UI" w:hAnsi="Nirmala UI" w:cs="Nirmala UI"/>
+          <w:lang w:bidi="bn-BD"/>
+        </w:rPr>
+        <w:t>নিয়ে</w:t>
+      </w:r>
+      <w:proofErr w:type="spellEnd"/>
+      <w:r>
+        <w:rPr>
+          <w:rFonts w:ascii="Nirmala UI" w:hAnsi="Nirmala UI" w:cs="Nirmala UI"/>
+          <w:lang w:bidi="bn-BD"/>
+        </w:rPr>
+        <w:t xml:space="preserve"> </w:t>
+      </w:r>
+      <w:proofErr w:type="spellStart"/>
+      <w:r>
+        <w:rPr>
+          <w:rFonts w:ascii="Nirmala UI" w:hAnsi="Nirmala UI" w:cs="Nirmala UI"/>
+          <w:lang w:bidi="bn-BD"/>
+        </w:rPr>
+        <w:t>অনুজ্জ্বল</w:t>
+      </w:r>
+      <w:proofErr w:type="spellEnd"/>
+      <w:r>
+        <w:rPr>
+          <w:rFonts w:ascii="Nirmala UI" w:hAnsi="Nirmala UI" w:cs="Nirmala UI"/>
+          <w:lang w:bidi="bn-BD"/>
+        </w:rPr>
+        <w:t xml:space="preserve"> </w:t>
+      </w:r>
+      <w:proofErr w:type="spellStart"/>
+      <w:r>
+        <w:rPr>
+          <w:rFonts w:ascii="Nirmala UI" w:hAnsi="Nirmala UI" w:cs="Nirmala UI"/>
+          <w:lang w:bidi="bn-BD"/>
+        </w:rPr>
+        <w:t>নীল</w:t>
+      </w:r>
+      <w:proofErr w:type="spellEnd"/>
+    </w:p>
+    <w:p>
+      <w:pPr>
+        <w:rPr>
+          <w:rFonts w:ascii="Nirmala UI" w:hAnsi="Nirmala UI" w:cs="Nirmala UI"/>
+          <w:lang w:bidi="bn-BD"/>
+        </w:rPr>
+      </w:pPr>
+      <w:proofErr w:type="spellStart"/>
+      <w:r>
+        <w:rPr>
+          <w:rFonts w:ascii="Nirmala UI" w:hAnsi="Nirmala UI" w:cs="Nirmala UI"/>
+          <w:lang w:bidi="bn-BD"/>
+        </w:rPr>
+        <w:t>পৌঁছে</w:t>
+      </w:r>
+      <w:proofErr w:type="spellEnd"/>
+      <w:r>
+        <w:rPr>
+          <w:rFonts w:ascii="Nirmala UI" w:hAnsi="Nirmala UI" w:cs="Nirmala UI"/>
+          <w:lang w:bidi="bn-BD"/>
+        </w:rPr>
+        <w:t xml:space="preserve"> </w:t>
+      </w:r>
+      <w:proofErr w:type="spellStart"/>
+      <w:r>
+        <w:rPr>
+          <w:rFonts w:ascii="Nirmala UI" w:hAnsi="Nirmala UI" w:cs="Nirmala UI"/>
+          <w:lang w:bidi="bn-BD"/>
+        </w:rPr>
+        <w:t>দিতে</w:t>
+      </w:r>
+      <w:proofErr w:type="spellEnd"/>
+      <w:r>
+        <w:rPr>
+          <w:rFonts w:ascii="Nirmala UI" w:hAnsi="Nirmala UI" w:cs="Nirmala UI"/>
+          <w:lang w:bidi="bn-BD"/>
+        </w:rPr>
+        <w:t xml:space="preserve"> </w:t>
+      </w:r>
+      <w:proofErr w:type="spellStart"/>
+      <w:r>
+        <w:rPr>
+          <w:rFonts w:ascii="Nirmala UI" w:hAnsi="Nirmala UI" w:cs="Nirmala UI"/>
+          <w:lang w:bidi="bn-BD"/>
+        </w:rPr>
+        <w:t>পুনরায়</w:t>
+      </w:r>
+      <w:proofErr w:type="spellEnd"/>
+      <w:r>
+        <w:rPr>
+          <w:rFonts w:ascii="Nirmala UI" w:hAnsi="Nirmala UI" w:cs="Nirmala UI"/>
+          <w:lang w:bidi="bn-BD"/>
+        </w:rPr>
+        <w:br/>
+      </w:r>
+    </w:p>
+    <w:p>
+      <w:pPr>
+        <w:rPr>
+          <w:rFonts w:ascii="Nirmala UI" w:hAnsi="Nirmala UI" w:cs="Nirmala UI"/>
+          <w:lang w:bidi="bn-BD"/>
+        </w:rPr>
+      </w:pPr>
+    </w:p>
+    <w:p>
+      <w:pPr>
+        <w:rPr>
+          <w:rFonts w:ascii="Nirmala UI" w:hAnsi="Nirmala UI" w:cs="Nirmala UI"/>
+          <w:lang w:bidi="bn-BD"/>
+        </w:rPr>
+      </w:pPr>
+    </w:p>
+    <w:p>
+      <w:pPr>
+        <w:rPr>
+          <w:rFonts w:ascii="Nirmala UI" w:hAnsi="Nirmala UI" w:cs="Nirmala UI"/>
+          <w:lang w:bidi="bn-BD"/>
+        </w:rPr>
+      </w:pPr>
+    </w:p>
+    <w:p>
+      <w:pPr>
+        <w:rPr>
+          <w:rFonts w:ascii="Nirmala UI" w:hAnsi="Nirmala UI" w:cs="Nirmala UI"/>
+          <w:lang w:bidi="bn-BD"/>
+        </w:rPr>
+      </w:pPr>
+    </w:p>
+    <w:p>
+      <w:pPr>
+        <w:rPr>
+          <w:rFonts w:ascii="Nirmala UI" w:hAnsi="Nirmala UI" w:cs="Nirmala UI"/>
+          <w:lang w:bidi="bn-BD"/>
+        </w:rPr>
+      </w:pPr>
+    </w:p>
+    <w:p>
+      <w:pPr>
+        <w:rPr>
+          <w:rFonts w:ascii="Nirmala UI" w:hAnsi="Nirmala UI" w:cs="Nirmala UI"/>
+          <w:lang w:bidi="bn-BD"/>
+        </w:rPr>
+      </w:pPr>
+    </w:p>
+    <w:p>
+      <w:pPr>
+        <w:rPr>
+          <w:rFonts w:ascii="Nirmala UI" w:hAnsi="Nirmala UI" w:cs="Nirmala UI"/>
+          <w:lang w:bidi="bn-BD"/>
+        </w:rPr>
+      </w:pPr>
+    </w:p>
+    <w:p>
+      <w:pPr>
+        <w:rPr>
+          <w:rFonts w:ascii="Nirmala UI" w:hAnsi="Nirmala UI" w:cs="Nirmala UI"/>
+          <w:lang w:bidi="bn-BD"/>
+        </w:rPr>
+      </w:pPr>
     </w:p>
     <w:p>
       <w:pPr>
@@ -3883,12 +4052,37 @@
           <w:lang w:bidi="bn-BD"/>
         </w:rPr>
       </w:pPr>
-      <w:r>
-        <w:rPr>
-          <w:rFonts w:ascii="Nirmala UI" w:hAnsi="Nirmala UI" w:cs="Nirmala UI"/>
-          <w:lang w:bidi="bn-BD"/>
-        </w:rPr>
-        <w:t xml:space="preserve">সম্ভবত আমি </w:t>
+      <w:proofErr w:type="spellStart"/>
+      <w:r>
+        <w:rPr>
+          <w:rFonts w:ascii="Nirmala UI" w:hAnsi="Nirmala UI" w:cs="Nirmala UI"/>
+          <w:lang w:bidi="bn-BD"/>
+        </w:rPr>
+        <w:t>সম্ভবত</w:t>
+      </w:r>
+      <w:proofErr w:type="spellEnd"/>
+      <w:r>
+        <w:rPr>
+          <w:rFonts w:ascii="Nirmala UI" w:hAnsi="Nirmala UI" w:cs="Nirmala UI"/>
+          <w:lang w:bidi="bn-BD"/>
+        </w:rPr>
+        <w:t xml:space="preserve"> </w:t>
+      </w:r>
+      <w:proofErr w:type="spellStart"/>
+      <w:r>
+        <w:rPr>
+          <w:rFonts w:ascii="Nirmala UI" w:hAnsi="Nirmala UI" w:cs="Nirmala UI"/>
+          <w:lang w:bidi="bn-BD"/>
+        </w:rPr>
+        <w:t>আমি</w:t>
+      </w:r>
+      <w:proofErr w:type="spellEnd"/>
+      <w:r>
+        <w:rPr>
+          <w:rFonts w:ascii="Nirmala UI" w:hAnsi="Nirmala UI" w:cs="Nirmala UI"/>
+          <w:lang w:bidi="bn-BD"/>
+        </w:rPr>
+        <w:t xml:space="preserve"> </w:t>
       </w:r>
       <w:proofErr w:type="spellStart"/>
       <w:r>
@@ -3939,12 +4133,21 @@
           <w:lang w:bidi="bn-BD"/>
         </w:rPr>
       </w:pPr>
-      <w:r>
-        <w:rPr>
-          <w:rFonts w:ascii="Nirmala UI" w:hAnsi="Nirmala UI" w:cs="Nirmala UI"/>
-          <w:lang w:bidi="bn-BD"/>
-        </w:rPr>
-        <w:t xml:space="preserve">এই </w:t>
+      <w:proofErr w:type="spellStart"/>
+      <w:r>
+        <w:rPr>
+          <w:rFonts w:ascii="Nirmala UI" w:hAnsi="Nirmala UI" w:cs="Nirmala UI"/>
+          <w:lang w:bidi="bn-BD"/>
+        </w:rPr>
+        <w:t>এই</w:t>
+      </w:r>
+      <w:proofErr w:type="spellEnd"/>
+      <w:r>
+        <w:rPr>
+          <w:rFonts w:ascii="Nirmala UI" w:hAnsi="Nirmala UI" w:cs="Nirmala UI"/>
+          <w:lang w:bidi="bn-BD"/>
+        </w:rPr>
+        <w:t xml:space="preserve"> </w:t>
       </w:r>
       <w:proofErr w:type="spellStart"/>
       <w:r>
@@ -4212,12 +4415,21 @@
           <w:lang w:bidi="bn-BD"/>
         </w:rPr>
       </w:pPr>
-      <w:r>
-        <w:rPr>
-          <w:rFonts w:ascii="Nirmala UI" w:hAnsi="Nirmala UI" w:cs="Nirmala UI"/>
-          <w:lang w:bidi="bn-BD"/>
-        </w:rPr>
-        <w:t xml:space="preserve">বেচারা </w:t>
+      <w:proofErr w:type="spellStart"/>
+      <w:r>
+        <w:rPr>
+          <w:rFonts w:ascii="Nirmala UI" w:hAnsi="Nirmala UI" w:cs="Nirmala UI"/>
+          <w:lang w:bidi="bn-BD"/>
+        </w:rPr>
+        <w:t>বেচারা</w:t>
+      </w:r>
+      <w:proofErr w:type="spellEnd"/>
+      <w:r>
+        <w:rPr>
+          <w:rFonts w:ascii="Nirmala UI" w:hAnsi="Nirmala UI" w:cs="Nirmala UI"/>
+          <w:lang w:bidi="bn-BD"/>
+        </w:rPr>
+        <w:t xml:space="preserve"> </w:t>
       </w:r>
       <w:proofErr w:type="spellStart"/>
       <w:r>
@@ -4582,12 +4794,37 @@
           <w:lang w:bidi="bn-BD"/>
         </w:rPr>
       </w:pPr>
-      <w:r>
-        <w:rPr>
-          <w:rFonts w:ascii="Nirmala UI" w:hAnsi="Nirmala UI" w:cs="Nirmala UI"/>
-          <w:lang w:bidi="bn-BD"/>
-        </w:rPr>
-        <w:t xml:space="preserve">সে সতর্ক </w:t>
+      <w:proofErr w:type="spellStart"/>
+      <w:r>
+        <w:rPr>
+          <w:rFonts w:ascii="Nirmala UI" w:hAnsi="Nirmala UI" w:cs="Nirmala UI"/>
+          <w:lang w:bidi="bn-BD"/>
+        </w:rPr>
+        <w:t>সে</w:t>
+      </w:r>
+      <w:proofErr w:type="spellEnd"/>
+      <w:r>
+        <w:rPr>
+          <w:rFonts w:ascii="Nirmala UI" w:hAnsi="Nirmala UI" w:cs="Nirmala UI"/>
+          <w:lang w:bidi="bn-BD"/>
+        </w:rPr>
+        <w:t xml:space="preserve"> </w:t>
+      </w:r>
+      <w:proofErr w:type="spellStart"/>
+      <w:r>
+        <w:rPr>
+          <w:rFonts w:ascii="Nirmala UI" w:hAnsi="Nirmala UI" w:cs="Nirmala UI"/>
+          <w:lang w:bidi="bn-BD"/>
+        </w:rPr>
+        <w:t>সতর্ক</w:t>
+      </w:r>
+      <w:proofErr w:type="spellEnd"/>
+      <w:r>
+        <w:rPr>
+          <w:rFonts w:ascii="Nirmala UI" w:hAnsi="Nirmala UI" w:cs="Nirmala UI"/>
+          <w:lang w:bidi="bn-BD"/>
+        </w:rPr>
+        <w:t xml:space="preserve"> </w:t>
       </w:r>
       <w:proofErr w:type="spellStart"/>
       <w:r>
@@ -5154,12 +5391,21 @@
           <w:lang w:bidi="bn-BD"/>
         </w:rPr>
       </w:pPr>
-      <w:r>
-        <w:rPr>
-          <w:rFonts w:ascii="Nirmala UI" w:hAnsi="Nirmala UI" w:cs="Nirmala UI"/>
-          <w:lang w:bidi="bn-BD"/>
-        </w:rPr>
-        <w:t xml:space="preserve">পৌঁছাবোই </w:t>
+      <w:proofErr w:type="spellStart"/>
+      <w:r>
+        <w:rPr>
+          <w:rFonts w:ascii="Nirmala UI" w:hAnsi="Nirmala UI" w:cs="Nirmala UI"/>
+          <w:lang w:bidi="bn-BD"/>
+        </w:rPr>
+        <w:t>পৌঁছাবোই</w:t>
+      </w:r>
+      <w:proofErr w:type="spellEnd"/>
+      <w:r>
+        <w:rPr>
+          <w:rFonts w:ascii="Nirmala UI" w:hAnsi="Nirmala UI" w:cs="Nirmala UI"/>
+          <w:lang w:bidi="bn-BD"/>
+        </w:rPr>
+        <w:t xml:space="preserve"> </w:t>
       </w:r>
       <w:proofErr w:type="spellStart"/>
       <w:r>
@@ -5275,7 +5521,7 @@
     <w:rPrDefault>
       <w:rPr>
         <w:rFonts w:ascii="Nirmala UI" w:eastAsia="Calibri" w:hAnsi="Nirmala UI" w:cs="Vrinda"/>
-        <w:lang w:val="en-US" w:eastAsia="en-US" w:bidi="ar-SA"/>
+        <w:lang w:val="en-US" w:eastAsia="en-US" w:bidi="bn-BD"/>
       </w:rPr>
     </w:rPrDefault>
     <w:pPrDefault/>
@@ -5665,7 +5911,7 @@
       <w:rFonts w:ascii="Times New Roman" w:eastAsia="SimSun" w:hAnsi="Times New Roman" w:cs="Times New Roman"/>
       <w:sz w:val="24"/>
       <w:szCs w:val="24"/>
-      <w:lang w:eastAsia="zh-CN"/>
+      <w:lang w:eastAsia="zh-CN" w:bidi="ar-SA"/>
     </w:rPr>
   </w:style>
   <w:style w:type="character" w:default="1" w:styleId="DefaultParagraphFont">

</xml_diff>